<commit_message>
Conteúdo 2: DRE por produto na letra c) e nova letra g) sobre estoque
Nos 7 exercícios de custeio por absorção:
- Letra c): a DRE pelo custeio por absorção passa a ser pedida por
  produto e total. O gabarito mostra receita, CPV, lucro bruto, margem
  bruta e despesas de venda por produto, e despesas fixas e resultado no
  total. Os totais não mudam.
- Nova letra g) (as letras a-f não mudam): situação hipotética em que a
  empresa produz 20% a mais do que vende. O gabarito calcula o estoque
  final pela absorção e pelo variável e mostra que a diferença entre os
  resultados são os custos indiretos que ficaram no estoque.
  Metalúrgica: só portões e grades (sob encomenda não forma estoque).
  Panificadora: excedente armazenado congelado.
Página e .docx; gabaritos cifrados de novo.

Co-Authored-By: Claude Opus 5.5 <noreply@anthropic.com>
Claude-Session: https://claude.ai/code/session_011MUGNEMWRsLJUKMUMKSx3L
</commit_message>
<xml_diff>
--- a/arquivos/Agroindustria_Grao_Dourado_Custeio_Absorcao_Enunciado.docx
+++ b/arquivos/Agroindustria_Grao_Dourado_Custeio_Absorcao_Enunciado.docx
@@ -1836,7 +1836,7 @@
         <w:spacing w:after="120"/>
       </w:pPr>
       <w:r>
-        <w:t xml:space="preserve">c) Monte a Demonstração do Resultado (DRE) pelo custeio por absorção — receita, custo dos produtos vendidos (CPV), lucro bruto, despesas do período e resultado — usando o rateio da letra b.</w:t>
+        <w:t>c) Monte a Demonstração do Resultado (DRE) pelo custeio por absorção, por produto e total — receita, custo dos produtos vendidos (CPV), lucro bruto, despesas do período e resultado — usando o rateio da letra b.</w:t>
       </w:r>
     </w:p>
     <w:p>
@@ -1861,6 +1861,14 @@
       </w:pPr>
       <w:r>
         <w:t xml:space="preserve">f) Em que situações o custeio por absorção é exigido ou mais adequado (ex.: demonstrações contábeis publicadas, apuração de imposto de renda, avaliação de estoques)? Por que ele não deve ser usado como base para decisões como a da letra e?</w:t>
+      </w:r>
+    </w:p>
+    <w:p>
+      <w:pPr>
+        <w:spacing w:after="120"/>
+      </w:pPr>
+      <w:r>
+        <w:t>g) Situação hipotética: suponha que, no mesmo ano, a agroindústria tivesse produzido 20% a mais de cada produto, mantendo as vendas, os preços, os custos diretos por unidade e o total dos custos indiretos de produção e das despesas. O excedente ficaria no estoque final. Pelo custeio por absorção, com o rateio por volume produzido (como na letra b), qual seria o valor do estoque final e o resultado do período? Compare com o resultado pelo custeio variável, em que os custos indiretos de produção são tratados como despesa do período, e explique a diferença.</w:t>
       </w:r>
     </w:p>
     <w:sectPr>

</xml_diff>